<commit_message>
docs: updated the docs and added go_router
</commit_message>
<xml_diff>
--- a/d5_part2_of_dart_oop.docx
+++ b/d5_part2_of_dart_oop.docx
@@ -76,55 +76,7 @@
           <w:sz w:val="32"/>
           <w:szCs w:val="32"/>
         </w:rPr>
-        <w:t xml:space="preserve"> method……………………………</w:t>
-      </w:r>
-      <w:r>
-        <w:rPr>
-          <w:rFonts w:cs="Calibri"/>
-          <w:sz w:val="32"/>
-          <w:szCs w:val="32"/>
-        </w:rPr>
-        <w:t>………</w:t>
-      </w:r>
-      <w:r>
-        <w:rPr>
-          <w:rFonts w:cs="Calibri"/>
-          <w:sz w:val="32"/>
-          <w:szCs w:val="32"/>
-        </w:rPr>
-        <w:t>..</w:t>
-      </w:r>
-      <w:r>
-        <w:rPr>
-          <w:rFonts w:cs="Calibri"/>
-          <w:sz w:val="32"/>
-          <w:szCs w:val="32"/>
-        </w:rPr>
-        <w:t>………</w:t>
-      </w:r>
-      <w:r>
-        <w:rPr>
-          <w:rFonts w:cs="Calibri"/>
-          <w:sz w:val="32"/>
-          <w:szCs w:val="32"/>
-        </w:rPr>
-        <w:t>…………</w:t>
-      </w:r>
-      <w:r>
-        <w:rPr>
-          <w:rFonts w:cs="Calibri"/>
-          <w:sz w:val="32"/>
-          <w:szCs w:val="32"/>
-        </w:rPr>
-        <w:t>…</w:t>
-      </w:r>
-      <w:r>
-        <w:rPr>
-          <w:rFonts w:cs="Calibri"/>
-          <w:sz w:val="32"/>
-          <w:szCs w:val="32"/>
-        </w:rPr>
-        <w:t>2</w:t>
+        <w:t xml:space="preserve"> method</w:t>
       </w:r>
     </w:p>
     <w:p>
@@ -189,39 +141,7 @@
           <w:sz w:val="32"/>
           <w:szCs w:val="32"/>
         </w:rPr>
-        <w:t xml:space="preserve"> method for Classes………</w:t>
-      </w:r>
-      <w:r>
-        <w:rPr>
-          <w:rFonts w:cs="Calibri"/>
-          <w:sz w:val="32"/>
-          <w:szCs w:val="32"/>
-        </w:rPr>
-        <w:t>.</w:t>
-      </w:r>
-      <w:r>
-        <w:rPr>
-          <w:rFonts w:cs="Calibri"/>
-          <w:sz w:val="32"/>
-          <w:szCs w:val="32"/>
-        </w:rPr>
-        <w:t>……………</w:t>
-      </w:r>
-      <w:r>
-        <w:rPr>
-          <w:rFonts w:cs="Calibri"/>
-          <w:sz w:val="32"/>
-          <w:szCs w:val="32"/>
-        </w:rPr>
-        <w:t>..</w:t>
-      </w:r>
-      <w:r>
-        <w:rPr>
-          <w:rFonts w:cs="Calibri"/>
-          <w:sz w:val="32"/>
-          <w:szCs w:val="32"/>
-        </w:rPr>
-        <w:t>……3</w:t>
+        <w:t xml:space="preserve"> method for Classes</w:t>
       </w:r>
     </w:p>
     <w:p>
@@ -276,48 +196,6 @@
         <w:t>hashCode</w:t>
       </w:r>
       <w:proofErr w:type="spellEnd"/>
-      <w:r>
-        <w:rPr>
-          <w:rFonts w:cs="Calibri"/>
-          <w:sz w:val="32"/>
-          <w:szCs w:val="32"/>
-        </w:rPr>
-        <w:t>……………………</w:t>
-      </w:r>
-      <w:proofErr w:type="gramStart"/>
-      <w:r>
-        <w:rPr>
-          <w:rFonts w:cs="Calibri"/>
-          <w:sz w:val="32"/>
-          <w:szCs w:val="32"/>
-        </w:rPr>
-        <w:t>…</w:t>
-      </w:r>
-      <w:r>
-        <w:rPr>
-          <w:rFonts w:cs="Calibri"/>
-          <w:sz w:val="32"/>
-          <w:szCs w:val="32"/>
-        </w:rPr>
-        <w:t>..</w:t>
-      </w:r>
-      <w:proofErr w:type="gramEnd"/>
-      <w:r>
-        <w:rPr>
-          <w:rFonts w:cs="Calibri"/>
-          <w:sz w:val="32"/>
-          <w:szCs w:val="32"/>
-        </w:rPr>
-        <w:t>………….</w:t>
-      </w:r>
-      <w:r>
-        <w:rPr>
-          <w:rFonts w:cs="Calibri"/>
-          <w:sz w:val="32"/>
-          <w:szCs w:val="32"/>
-        </w:rPr>
-        <w:t>4</w:t>
-      </w:r>
     </w:p>
     <w:p>
       <w:pPr>
@@ -347,57 +225,7 @@
           <w:sz w:val="32"/>
           <w:szCs w:val="32"/>
         </w:rPr>
-        <w:t xml:space="preserve">e </w:t>
-      </w:r>
-      <w:proofErr w:type="gramStart"/>
-      <w:r>
-        <w:rPr>
-          <w:rFonts w:cs="Calibri"/>
-          <w:sz w:val="32"/>
-          <w:szCs w:val="32"/>
-        </w:rPr>
-        <w:t>Class..</w:t>
-      </w:r>
-      <w:proofErr w:type="gramEnd"/>
-      <w:r>
-        <w:rPr>
-          <w:rFonts w:cs="Calibri"/>
-          <w:sz w:val="32"/>
-          <w:szCs w:val="32"/>
-        </w:rPr>
-        <w:t>…………………………………</w:t>
-      </w:r>
-      <w:r>
-        <w:rPr>
-          <w:rFonts w:cs="Calibri"/>
-          <w:sz w:val="32"/>
-          <w:szCs w:val="32"/>
-        </w:rPr>
-        <w:t>………</w:t>
-      </w:r>
-      <w:r>
-        <w:rPr>
-          <w:rFonts w:cs="Calibri"/>
-          <w:sz w:val="32"/>
-          <w:szCs w:val="32"/>
-        </w:rPr>
-        <w:t>..</w:t>
-      </w:r>
-      <w:r>
-        <w:rPr>
-          <w:rFonts w:cs="Calibri"/>
-          <w:sz w:val="32"/>
-          <w:szCs w:val="32"/>
-        </w:rPr>
-        <w:t>.</w:t>
-      </w:r>
-      <w:r>
-        <w:rPr>
-          <w:rFonts w:cs="Calibri"/>
-          <w:sz w:val="32"/>
-          <w:szCs w:val="32"/>
-        </w:rPr>
-        <w:t>7</w:t>
+        <w:t>e Class</w:t>
       </w:r>
     </w:p>
     <w:p>
@@ -442,39 +270,7 @@
           <w:sz w:val="32"/>
           <w:szCs w:val="32"/>
         </w:rPr>
-        <w:t>method…………………………</w:t>
-      </w:r>
-      <w:r>
-        <w:rPr>
-          <w:rFonts w:cs="Calibri"/>
-          <w:sz w:val="32"/>
-          <w:szCs w:val="32"/>
-        </w:rPr>
-        <w:t>…..</w:t>
-      </w:r>
-      <w:r>
-        <w:rPr>
-          <w:rFonts w:cs="Calibri"/>
-          <w:sz w:val="32"/>
-          <w:szCs w:val="32"/>
-        </w:rPr>
-        <w:t>…………</w:t>
-      </w:r>
-      <w:r>
-        <w:rPr>
-          <w:rFonts w:cs="Calibri"/>
-          <w:sz w:val="32"/>
-          <w:szCs w:val="32"/>
-        </w:rPr>
-        <w:t>………………………</w:t>
-      </w:r>
-      <w:r>
-        <w:rPr>
-          <w:rFonts w:cs="Calibri"/>
-          <w:sz w:val="32"/>
-          <w:szCs w:val="32"/>
-        </w:rPr>
-        <w:t>10</w:t>
+        <w:t>method</w:t>
       </w:r>
     </w:p>
     <w:p>
@@ -525,46 +321,6 @@
         </w:rPr>
         <w:t>)</w:t>
       </w:r>
-      <w:r>
-        <w:rPr>
-          <w:rFonts w:cs="Calibri"/>
-          <w:sz w:val="32"/>
-          <w:szCs w:val="32"/>
-        </w:rPr>
-        <w:t>………………………</w:t>
-      </w:r>
-      <w:r>
-        <w:rPr>
-          <w:rFonts w:cs="Calibri"/>
-          <w:sz w:val="32"/>
-          <w:szCs w:val="32"/>
-        </w:rPr>
-        <w:t>……………</w:t>
-      </w:r>
-      <w:r>
-        <w:rPr>
-          <w:rFonts w:cs="Calibri"/>
-          <w:sz w:val="32"/>
-          <w:szCs w:val="32"/>
-        </w:rPr>
-        <w:t>…………………….</w:t>
-      </w:r>
-      <w:r>
-        <w:rPr>
-          <w:rFonts w:cs="Calibri"/>
-          <w:sz w:val="32"/>
-          <w:szCs w:val="32"/>
-        </w:rPr>
-        <w:t>1</w:t>
-      </w:r>
-      <w:r>
-        <w:rPr>
-          <w:rFonts w:cs="Calibri"/>
-          <w:sz w:val="32"/>
-          <w:szCs w:val="32"/>
-        </w:rPr>
-        <w:t>1</w:t>
-      </w:r>
     </w:p>
     <w:p>
       <w:pPr>
@@ -586,49 +342,7 @@
           <w:sz w:val="32"/>
           <w:szCs w:val="32"/>
         </w:rPr>
-        <w:t>Async constructor and Async in classes………</w:t>
-      </w:r>
-      <w:proofErr w:type="gramStart"/>
-      <w:r>
-        <w:rPr>
-          <w:rFonts w:cs="Calibri"/>
-          <w:sz w:val="32"/>
-          <w:szCs w:val="32"/>
-        </w:rPr>
-        <w:t>…</w:t>
-      </w:r>
-      <w:r>
-        <w:rPr>
-          <w:rFonts w:cs="Calibri"/>
-          <w:sz w:val="32"/>
-          <w:szCs w:val="32"/>
-        </w:rPr>
-        <w:t>..</w:t>
-      </w:r>
-      <w:proofErr w:type="gramEnd"/>
-      <w:r>
-        <w:rPr>
-          <w:rFonts w:cs="Calibri"/>
-          <w:sz w:val="32"/>
-          <w:szCs w:val="32"/>
-        </w:rPr>
-        <w:t>……………</w:t>
-      </w:r>
-      <w:r>
-        <w:rPr>
-          <w:rFonts w:cs="Calibri"/>
-          <w:sz w:val="32"/>
-          <w:szCs w:val="32"/>
-        </w:rPr>
-        <w:t>….</w:t>
-      </w:r>
-      <w:r>
-        <w:rPr>
-          <w:rFonts w:cs="Calibri"/>
-          <w:sz w:val="32"/>
-          <w:szCs w:val="32"/>
-        </w:rPr>
-        <w:t>12</w:t>
+        <w:t>Async constructor and Async in classes</w:t>
       </w:r>
     </w:p>
     <w:p>
@@ -669,39 +383,7 @@
           <w:sz w:val="32"/>
           <w:szCs w:val="32"/>
         </w:rPr>
-        <w:t xml:space="preserve"> class………………………………</w:t>
-      </w:r>
-      <w:r>
-        <w:rPr>
-          <w:rFonts w:cs="Calibri"/>
-          <w:sz w:val="32"/>
-          <w:szCs w:val="32"/>
-        </w:rPr>
-        <w:t>………………</w:t>
-      </w:r>
-      <w:r>
-        <w:rPr>
-          <w:rFonts w:cs="Calibri"/>
-          <w:sz w:val="32"/>
-          <w:szCs w:val="32"/>
-        </w:rPr>
-        <w:t>….</w:t>
-      </w:r>
-      <w:r>
-        <w:rPr>
-          <w:rFonts w:cs="Calibri"/>
-          <w:sz w:val="32"/>
-          <w:szCs w:val="32"/>
-        </w:rPr>
-        <w:t>1</w:t>
-      </w:r>
-      <w:r>
-        <w:rPr>
-          <w:rFonts w:cs="Calibri"/>
-          <w:sz w:val="32"/>
-          <w:szCs w:val="32"/>
-        </w:rPr>
-        <w:t>3</w:t>
+        <w:t xml:space="preserve"> class</w:t>
       </w:r>
     </w:p>
     <w:p>
@@ -776,46 +458,6 @@
         </w:rPr>
         <w:t>s</w:t>
       </w:r>
-      <w:r>
-        <w:rPr>
-          <w:rFonts w:cs="Calibri"/>
-          <w:sz w:val="32"/>
-          <w:szCs w:val="32"/>
-        </w:rPr>
-        <w:t>………………………………</w:t>
-      </w:r>
-      <w:r>
-        <w:rPr>
-          <w:rFonts w:cs="Calibri"/>
-          <w:sz w:val="32"/>
-          <w:szCs w:val="32"/>
-        </w:rPr>
-        <w:t>………</w:t>
-      </w:r>
-      <w:r>
-        <w:rPr>
-          <w:rFonts w:cs="Calibri"/>
-          <w:sz w:val="32"/>
-          <w:szCs w:val="32"/>
-        </w:rPr>
-        <w:t>…………</w:t>
-      </w:r>
-      <w:r>
-        <w:rPr>
-          <w:rFonts w:cs="Calibri"/>
-          <w:sz w:val="32"/>
-          <w:szCs w:val="32"/>
-        </w:rPr>
-        <w:t>1</w:t>
-      </w:r>
-      <w:r>
-        <w:rPr>
-          <w:rFonts w:cs="Calibri"/>
-          <w:sz w:val="32"/>
-          <w:szCs w:val="32"/>
-        </w:rPr>
-        <w:t>5</w:t>
-      </w:r>
     </w:p>
     <w:p>
       <w:pPr>
@@ -881,65 +523,7 @@
           <w:sz w:val="32"/>
           <w:szCs w:val="32"/>
         </w:rPr>
-        <w:t>).</w:t>
-      </w:r>
-      <w:r>
-        <w:rPr>
-          <w:rFonts w:cs="Calibri"/>
-          <w:sz w:val="32"/>
-          <w:szCs w:val="32"/>
-        </w:rPr>
-        <w:t>…</w:t>
-      </w:r>
-      <w:proofErr w:type="gramStart"/>
-      <w:r>
-        <w:rPr>
-          <w:rFonts w:cs="Calibri"/>
-          <w:sz w:val="32"/>
-          <w:szCs w:val="32"/>
-        </w:rPr>
-        <w:t>…</w:t>
-      </w:r>
-      <w:r>
-        <w:rPr>
-          <w:rFonts w:cs="Calibri"/>
-          <w:sz w:val="32"/>
-          <w:szCs w:val="32"/>
-        </w:rPr>
-        <w:t>..</w:t>
-      </w:r>
-      <w:proofErr w:type="gramEnd"/>
-      <w:r>
-        <w:rPr>
-          <w:rFonts w:cs="Calibri"/>
-          <w:sz w:val="32"/>
-          <w:szCs w:val="32"/>
-        </w:rPr>
-        <w:t>…</w:t>
-      </w:r>
-      <w:r>
-        <w:rPr>
-          <w:rFonts w:cs="Calibri"/>
-          <w:sz w:val="32"/>
-          <w:szCs w:val="32"/>
-        </w:rPr>
-        <w:t>….</w:t>
-      </w:r>
-      <w:r>
-        <w:rPr>
-          <w:rFonts w:cs="Calibri"/>
-          <w:sz w:val="32"/>
-          <w:szCs w:val="32"/>
-        </w:rPr>
-        <w:t>1</w:t>
-      </w:r>
-      <w:r>
-        <w:rPr>
-          <w:rFonts w:cs="Calibri"/>
-          <w:sz w:val="32"/>
-          <w:szCs w:val="32"/>
-        </w:rPr>
-        <w:t>7</w:t>
+        <w:t>)</w:t>
       </w:r>
     </w:p>
     <w:p>
@@ -974,22 +558,6 @@
         </w:rPr>
         <w:t>Dart</w:t>
       </w:r>
-      <w:r>
-        <w:rPr>
-          <w:rFonts w:cs="Calibri"/>
-          <w:sz w:val="32"/>
-          <w:szCs w:val="32"/>
-        </w:rPr>
-        <w:t>………………………….</w:t>
-      </w:r>
-      <w:r>
-        <w:rPr>
-          <w:rFonts w:cs="Calibri"/>
-          <w:sz w:val="32"/>
-          <w:szCs w:val="32"/>
-        </w:rPr>
-        <w:t>18</w:t>
-      </w:r>
     </w:p>
     <w:p>
       <w:pPr>
@@ -1023,54 +591,6 @@
         </w:rPr>
         <w:t>Interfaces</w:t>
       </w:r>
-      <w:r>
-        <w:rPr>
-          <w:rFonts w:cs="Calibri"/>
-          <w:sz w:val="32"/>
-          <w:szCs w:val="32"/>
-        </w:rPr>
-        <w:t>……………………………………</w:t>
-      </w:r>
-      <w:r>
-        <w:rPr>
-          <w:rFonts w:cs="Calibri"/>
-          <w:sz w:val="32"/>
-          <w:szCs w:val="32"/>
-        </w:rPr>
-        <w:t>………</w:t>
-      </w:r>
-      <w:r>
-        <w:rPr>
-          <w:rFonts w:cs="Calibri"/>
-          <w:sz w:val="32"/>
-          <w:szCs w:val="32"/>
-        </w:rPr>
-        <w:t>…</w:t>
-      </w:r>
-      <w:r>
-        <w:rPr>
-          <w:rFonts w:cs="Calibri"/>
-          <w:sz w:val="32"/>
-          <w:szCs w:val="32"/>
-        </w:rPr>
-        <w:t>…</w:t>
-      </w:r>
-      <w:r>
-        <w:rPr>
-          <w:rFonts w:cs="Calibri"/>
-          <w:sz w:val="32"/>
-          <w:szCs w:val="32"/>
-        </w:rPr>
-        <w:t>…….</w:t>
-      </w:r>
-      <w:r>
-        <w:rPr>
-          <w:rFonts w:cs="Calibri"/>
-          <w:sz w:val="32"/>
-          <w:szCs w:val="32"/>
-        </w:rPr>
-        <w:t>20</w:t>
-      </w:r>
     </w:p>
     <w:p>
       <w:pPr>
@@ -1112,55 +632,7 @@
           <w:sz w:val="32"/>
           <w:szCs w:val="32"/>
         </w:rPr>
-        <w:t xml:space="preserve"> class……………………………</w:t>
-      </w:r>
-      <w:r>
-        <w:rPr>
-          <w:rFonts w:cs="Calibri"/>
-          <w:sz w:val="32"/>
-          <w:szCs w:val="32"/>
-        </w:rPr>
-        <w:t>…</w:t>
-      </w:r>
-      <w:r>
-        <w:rPr>
-          <w:rFonts w:cs="Calibri"/>
-          <w:sz w:val="32"/>
-          <w:szCs w:val="32"/>
-        </w:rPr>
-        <w:t>……………………</w:t>
-      </w:r>
-      <w:r>
-        <w:rPr>
-          <w:rFonts w:cs="Calibri"/>
-          <w:sz w:val="32"/>
-          <w:szCs w:val="32"/>
-        </w:rPr>
-        <w:t>.</w:t>
-      </w:r>
-      <w:r>
-        <w:rPr>
-          <w:rFonts w:cs="Calibri"/>
-          <w:sz w:val="32"/>
-          <w:szCs w:val="32"/>
-        </w:rPr>
-        <w:t>…</w:t>
-      </w:r>
-      <w:r>
-        <w:rPr>
-          <w:rFonts w:cs="Calibri"/>
-          <w:sz w:val="32"/>
-          <w:szCs w:val="32"/>
-        </w:rPr>
-        <w:t>2</w:t>
-      </w:r>
-      <w:r>
-        <w:rPr>
-          <w:rFonts w:cs="Calibri"/>
-          <w:sz w:val="32"/>
-          <w:szCs w:val="32"/>
-        </w:rPr>
-        <w:t>2</w:t>
+        <w:t xml:space="preserve"> class</w:t>
       </w:r>
     </w:p>
     <w:p>
@@ -1221,73 +693,7 @@
           <w:sz w:val="32"/>
           <w:szCs w:val="32"/>
         </w:rPr>
-        <w:t xml:space="preserve"> (List </w:t>
-      </w:r>
-      <w:proofErr w:type="gramStart"/>
-      <w:r>
-        <w:rPr>
-          <w:rFonts w:cs="Calibri"/>
-          <w:sz w:val="32"/>
-          <w:szCs w:val="32"/>
-        </w:rPr>
-        <w:t>Encapsulation)</w:t>
-      </w:r>
-      <w:r>
-        <w:rPr>
-          <w:rFonts w:cs="Calibri"/>
-          <w:sz w:val="32"/>
-          <w:szCs w:val="32"/>
-        </w:rPr>
-        <w:t>…</w:t>
-      </w:r>
-      <w:proofErr w:type="gramEnd"/>
-      <w:r>
-        <w:rPr>
-          <w:rFonts w:cs="Calibri"/>
-          <w:sz w:val="32"/>
-          <w:szCs w:val="32"/>
-        </w:rPr>
-        <w:t>……</w:t>
-      </w:r>
-      <w:r>
-        <w:rPr>
-          <w:rFonts w:cs="Calibri"/>
-          <w:sz w:val="32"/>
-          <w:szCs w:val="32"/>
-        </w:rPr>
-        <w:t>……</w:t>
-      </w:r>
-      <w:r>
-        <w:rPr>
-          <w:rFonts w:cs="Calibri"/>
-          <w:sz w:val="32"/>
-          <w:szCs w:val="32"/>
-        </w:rPr>
-        <w:t>.</w:t>
-      </w:r>
-      <w:r>
-        <w:rPr>
-          <w:rFonts w:cs="Calibri"/>
-          <w:sz w:val="32"/>
-          <w:szCs w:val="32"/>
-        </w:rPr>
-        <w:t>………</w:t>
-      </w:r>
-      <w:r>
-        <w:rPr>
-          <w:rFonts w:cs="Calibri"/>
-          <w:sz w:val="32"/>
-          <w:szCs w:val="32"/>
-        </w:rPr>
-        <w:t>2</w:t>
-      </w:r>
-      <w:r>
-        <w:rPr>
-          <w:rFonts w:cs="Calibri"/>
-          <w:sz w:val="32"/>
-          <w:szCs w:val="32"/>
-        </w:rPr>
-        <w:t>6</w:t>
+        <w:t xml:space="preserve"> (List Encapsulation)</w:t>
       </w:r>
     </w:p>
     <w:p>
@@ -1310,65 +716,7 @@
           <w:sz w:val="32"/>
           <w:szCs w:val="32"/>
         </w:rPr>
-        <w:t xml:space="preserve">Cascade Operator (or </w:t>
-      </w:r>
-      <w:proofErr w:type="gramStart"/>
-      <w:r>
-        <w:rPr>
-          <w:rFonts w:cs="Calibri"/>
-          <w:sz w:val="32"/>
-          <w:szCs w:val="32"/>
-        </w:rPr>
-        <w:t>Notation)…</w:t>
-      </w:r>
-      <w:proofErr w:type="gramEnd"/>
-      <w:r>
-        <w:rPr>
-          <w:rFonts w:cs="Calibri"/>
-          <w:sz w:val="32"/>
-          <w:szCs w:val="32"/>
-        </w:rPr>
-        <w:t>………</w:t>
-      </w:r>
-      <w:r>
-        <w:rPr>
-          <w:rFonts w:cs="Calibri"/>
-          <w:sz w:val="32"/>
-          <w:szCs w:val="32"/>
-        </w:rPr>
-        <w:t>…</w:t>
-      </w:r>
-      <w:r>
-        <w:rPr>
-          <w:rFonts w:cs="Calibri"/>
-          <w:sz w:val="32"/>
-          <w:szCs w:val="32"/>
-        </w:rPr>
-        <w:t>…………………………</w:t>
-      </w:r>
-      <w:r>
-        <w:rPr>
-          <w:rFonts w:cs="Calibri"/>
-          <w:sz w:val="32"/>
-          <w:szCs w:val="32"/>
-        </w:rPr>
-        <w:t>.</w:t>
-      </w:r>
-      <w:r>
-        <w:rPr>
-          <w:rFonts w:cs="Calibri"/>
-          <w:sz w:val="32"/>
-          <w:szCs w:val="32"/>
-        </w:rPr>
-        <w:t>2</w:t>
-      </w:r>
-      <w:r>
-        <w:rPr>
-          <w:rFonts w:cs="Calibri"/>
-          <w:sz w:val="32"/>
-          <w:szCs w:val="32"/>
-        </w:rPr>
-        <w:t>8</w:t>
+        <w:t>Cascade Operator (or Notation)</w:t>
       </w:r>
     </w:p>
     <w:p>
@@ -1407,31 +755,7 @@
           <w:sz w:val="32"/>
           <w:szCs w:val="32"/>
         </w:rPr>
-        <w:t>)…………………</w:t>
-      </w:r>
-      <w:r>
-        <w:rPr>
-          <w:rFonts w:cs="Calibri"/>
-          <w:sz w:val="32"/>
-          <w:szCs w:val="32"/>
-        </w:rPr>
-        <w:t>………………………..</w:t>
-      </w:r>
-      <w:r>
-        <w:rPr>
-          <w:rFonts w:cs="Calibri"/>
-          <w:sz w:val="32"/>
-          <w:szCs w:val="32"/>
-        </w:rPr>
-        <w:t>.</w:t>
-      </w:r>
-      <w:r>
-        <w:rPr>
-          <w:rFonts w:cs="Calibri"/>
-          <w:sz w:val="32"/>
-          <w:szCs w:val="32"/>
-        </w:rPr>
-        <w:t>30</w:t>
+        <w:t>)</w:t>
       </w:r>
     </w:p>
     <w:p>
@@ -1454,49 +778,7 @@
           <w:sz w:val="32"/>
           <w:szCs w:val="32"/>
         </w:rPr>
-        <w:t>Concise Constructors (New)……………</w:t>
-      </w:r>
-      <w:proofErr w:type="gramStart"/>
-      <w:r>
-        <w:rPr>
-          <w:rFonts w:cs="Calibri"/>
-          <w:sz w:val="32"/>
-          <w:szCs w:val="32"/>
-        </w:rPr>
-        <w:t>…</w:t>
-      </w:r>
-      <w:r>
-        <w:rPr>
-          <w:rFonts w:cs="Calibri"/>
-          <w:sz w:val="32"/>
-          <w:szCs w:val="32"/>
-        </w:rPr>
-        <w:t>..</w:t>
-      </w:r>
-      <w:proofErr w:type="gramEnd"/>
-      <w:r>
-        <w:rPr>
-          <w:rFonts w:cs="Calibri"/>
-          <w:sz w:val="32"/>
-          <w:szCs w:val="32"/>
-        </w:rPr>
-        <w:t>…………………………</w:t>
-      </w:r>
-      <w:r>
-        <w:rPr>
-          <w:rFonts w:cs="Calibri"/>
-          <w:sz w:val="32"/>
-          <w:szCs w:val="32"/>
-        </w:rPr>
-        <w:t>3</w:t>
-      </w:r>
-      <w:r>
-        <w:rPr>
-          <w:rFonts w:cs="Calibri"/>
-          <w:sz w:val="32"/>
-          <w:szCs w:val="32"/>
-        </w:rPr>
-        <w:t>6</w:t>
+        <w:t>Concise Constructors (New)</w:t>
       </w:r>
     </w:p>
     <w:p>
@@ -1519,25 +801,8 @@
           <w:sz w:val="32"/>
           <w:szCs w:val="32"/>
         </w:rPr>
-        <w:t>Private Named Parameters in Dart……………………………………</w:t>
-      </w:r>
-      <w:r>
-        <w:rPr>
-          <w:rFonts w:cs="Calibri"/>
-          <w:sz w:val="32"/>
-          <w:szCs w:val="32"/>
-        </w:rPr>
-        <w:t>38</w:t>
-      </w:r>
-    </w:p>
-    <w:p>
-      <w:pPr>
-        <w:rPr>
-          <w:rFonts w:cs="Calibri"/>
-          <w:sz w:val="32"/>
-          <w:szCs w:val="32"/>
-        </w:rPr>
-      </w:pPr>
+        <w:t>Private Named Parameters in Dart</w:t>
+      </w:r>
       <w:r>
         <w:rPr>
           <w:rFonts w:cs="Calibri"/>
@@ -27456,7 +26721,25 @@
           <w:sz w:val="32"/>
           <w:szCs w:val="32"/>
         </w:rPr>
-        <w:t xml:space="preserve"> becomes new </w:t>
+        <w:t xml:space="preserve"> becomes </w:t>
+      </w:r>
+      <w:r>
+        <w:rPr>
+          <w:rFonts w:cs="Calibri"/>
+          <w:b/>
+          <w:bCs/>
+          <w:sz w:val="32"/>
+          <w:szCs w:val="32"/>
+        </w:rPr>
+        <w:t>new</w:t>
+      </w:r>
+      <w:r>
+        <w:rPr>
+          <w:rFonts w:cs="Calibri"/>
+          <w:sz w:val="32"/>
+          <w:szCs w:val="32"/>
+        </w:rPr>
+        <w:t xml:space="preserve"> </w:t>
       </w:r>
       <w:proofErr w:type="gramStart"/>
       <w:r>
@@ -28394,16 +27677,6 @@
         <w:jc w:val="both"/>
         <w:rPr>
           <w:rFonts w:cs="Calibri"/>
-          <w:sz w:val="32"/>
-          <w:szCs w:val="32"/>
-        </w:rPr>
-      </w:pPr>
-    </w:p>
-    <w:p>
-      <w:pPr>
-        <w:jc w:val="both"/>
-        <w:rPr>
-          <w:rFonts w:cs="Calibri"/>
           <w:b/>
           <w:bCs/>
           <w:sz w:val="32"/>
@@ -28779,7 +28052,25 @@
           <w:sz w:val="32"/>
           <w:szCs w:val="32"/>
         </w:rPr>
-        <w:t>Instead, we had to use a normal parameter and manually assign it in the initializer list</w:t>
+        <w:t xml:space="preserve">Instead, we had to use a normal parameter and manually assign it in the </w:t>
+      </w:r>
+      <w:proofErr w:type="gramStart"/>
+      <w:r>
+        <w:rPr>
+          <w:rFonts w:cs="Calibri"/>
+          <w:sz w:val="32"/>
+          <w:szCs w:val="32"/>
+        </w:rPr>
+        <w:t>constructors</w:t>
+      </w:r>
+      <w:proofErr w:type="gramEnd"/>
+      <w:r>
+        <w:rPr>
+          <w:rFonts w:cs="Calibri"/>
+          <w:sz w:val="32"/>
+          <w:szCs w:val="32"/>
+        </w:rPr>
+        <w:t xml:space="preserve"> body</w:t>
       </w:r>
       <w:r>
         <w:rPr>
@@ -29854,17 +29145,17 @@
   <w:abstractNum w:abstractNumId="2" w15:restartNumberingAfterBreak="0">
     <w:nsid w:val="11C01B87"/>
     <w:multiLevelType w:val="hybridMultilevel"/>
-    <w:tmpl w:val="BB6244BE"/>
-    <w:lvl w:ilvl="0" w:tplc="04090001">
+    <w:tmpl w:val="A56A434E"/>
+    <w:lvl w:ilvl="0" w:tplc="0409000F">
       <w:start w:val="1"/>
-      <w:numFmt w:val="bullet"/>
-      <w:lvlText w:val=""/>
+      <w:numFmt w:val="decimal"/>
+      <w:lvlText w:val="%1."/>
       <w:lvlJc w:val="left"/>
       <w:pPr>
         <w:ind w:left="360" w:hanging="360"/>
       </w:pPr>
       <w:rPr>
-        <w:rFonts w:ascii="Symbol" w:hAnsi="Symbol" w:hint="default"/>
+        <w:rFonts w:hint="default"/>
         <w:b/>
         <w:bCs/>
       </w:rPr>

</xml_diff>